<commit_message>
docs: update Zenodo DOI to v1.0.2 record (10.5281/zenodo.20756030)
Co-authored-by: Cursor <cursoragent@cursor.com>
</commit_message>
<xml_diff>
--- a/04_Manuscripts/10Manuscript_health_policy_submission_v1_anonymous.docx
+++ b/04_Manuscripts/10Manuscript_health_policy_submission_v1_anonymous.docx
@@ -1293,12 +1293,8 @@
         <w:pStyle w:val="FirstParagraph"/>
       </w:pPr>
       <w:r>
-        <w:t>The NDB Open Data used in this analysis are publicly available from the Ministry of Health, Labour and Welfare of Japan (https://www.mhlw.go.jp/stf/seisakunitsuite/bunya/0000177182.html). Analysis code is openly available on GitHub (https://github.com/haruki00430/NDB_POFM) and archived on Zenodo (https://doi.org/10.5281/zenodo.20755988).</w:t>
-      </w:r>
-      <w:proofErr w:type="spellStart"/>
-      <w:r/>
-      <w:proofErr w:type="spellEnd"/>
-      <w:r/>
+        <w:t>The NDB Open Data used in this analysis are publicly available from the Ministry of Health, Labour and Welfare of Japan (https://www.mhlw.go.jp/stf/seisakunitsuite/bunya/0000177182.html). Analysis code is openly available on GitHub (https://github.com/haruki00430/NDB_POFM) and archived on Zenodo (https://doi.org/10.5281/zenodo.20756030).</w:t>
+      </w:r>
     </w:p>
     <w:p>
       <w:pPr>

</xml_diff>

<commit_message>
fix: anonymize public repo for double-blind peer review
Remove author-identifying files from git tracking, blind Data Availability in anonymous DOCX (Zenodo only during review), add flake8 config and submission prep scripts, and clean unused imports in analysis scripts.

Co-authored-by: Cursor <cursoragent@cursor.com>
</commit_message>
<xml_diff>
--- a/04_Manuscripts/10Manuscript_health_policy_submission_v1_anonymous.docx
+++ b/04_Manuscripts/10Manuscript_health_policy_submission_v1_anonymous.docx
@@ -78,7 +78,7 @@
     </w:p>
     <w:p>
       <w:r>
-        <w:t xml:space="preserve">Objective: To </w:t>
+        <w:t xml:space="preserve">Objectives: To </w:t>
       </w:r>
       <w:proofErr w:type="spellStart"/>
       <w:r>
@@ -1293,7 +1293,7 @@
         <w:pStyle w:val="FirstParagraph"/>
       </w:pPr>
       <w:r>
-        <w:t>The NDB Open Data used in this analysis are publicly available from the Ministry of Health, Labour and Welfare of Japan (https://www.mhlw.go.jp/stf/seisakunitsuite/bunya/0000177182.html). Analysis code is openly available on GitHub (https://github.com/haruki00430/NDB_POFM) and archived on Zenodo (https://doi.org/10.5281/zenodo.20756030).</w:t>
+        <w:t>The NDB Open Data used in this analysis are publicly available from the Ministry of Health, Labour and Welfare of Japan (https://www.mhlw.go.jp/stf/seisakunitsuite/bunya/0000177182.html). Analysis code is archived on Zenodo (https://doi.org/10.5281/zenodo.20756030). A public GitHub repository link will be provided upon acceptance.</w:t>
       </w:r>
     </w:p>
     <w:p>
@@ -1303,7 +1303,7 @@
       <w:bookmarkStart w:id="31" w:name="author-contributions"/>
       <w:bookmarkEnd w:id="30"/>
       <w:r>
-        <w:t>Author Contributions</w:t>
+        <w:t>[Author contributions are provided on the separate title page for double-anonymized peer review.]</w:t>
       </w:r>
     </w:p>
     <w:p>
@@ -1318,13 +1318,11 @@
           <w:rFonts w:asciiTheme="majorHAnsi" w:hAnsiTheme="majorHAnsi" w:cstheme="majorHAnsi" w:hint="eastAsia"/>
           <w:lang w:eastAsia="ja-JP"/>
         </w:rPr>
-        <w:t>Haruki Saito</w:t>
       </w:r>
       <w:r>
         <w:rPr>
           <w:rFonts w:asciiTheme="majorHAnsi" w:hAnsiTheme="majorHAnsi" w:cstheme="majorHAnsi"/>
         </w:rPr>
-        <w:t>: Conceptualization, Data curation, Formal analysis, Investigation, Methodology, Software, Visualization, Writing – original draft, Writing – review and editing.</w:t>
       </w:r>
     </w:p>
     <w:p>
@@ -1340,11 +1338,8 @@
           <w:rFonts w:hint="eastAsia"/>
           <w:lang w:eastAsia="ja-JP"/>
         </w:rPr>
-        <w:t>Tetsuya Ohira</w:t>
-      </w:r>
-      <w:r>
-        <w:t>: Conceptualization, Supervision, Writing – review and editing.</w:t>
-      </w:r>
+      </w:r>
+      <w:r/>
     </w:p>
     <w:p>
       <w:pPr>

</xml_diff>

<commit_message>
fix: sync blinded anonymous DOCX and ignore Word lock files
Co-authored-by: Cursor <cursoragent@cursor.com>
</commit_message>
<xml_diff>
--- a/04_Manuscripts/10Manuscript_health_policy_submission_v1_anonymous.docx
+++ b/04_Manuscripts/10Manuscript_health_policy_submission_v1_anonymous.docx
@@ -78,15 +78,24 @@
     </w:p>
     <w:p>
       <w:r>
-        <w:t xml:space="preserve">Objectives: To </w:t>
-      </w:r>
-      <w:proofErr w:type="spellStart"/>
-      <w:r>
-        <w:t>characterise</w:t>
-      </w:r>
-      <w:proofErr w:type="spellEnd"/>
-      <w:r>
-        <w:t xml:space="preserve"> prefectural variation in perioperative oral functional management (POFM) delivery across Japan, examine whether this variation was associated with cancer surgical demand or with dental workforce supply, and assess spatial clustering of POFM implementation.</w:t>
+        <w:rPr>
+          <w:b/>
+          <w:bCs/>
+        </w:rPr>
+        <w:t>Objectives:</w:t>
+      </w:r>
+      <w:r>
+        <w:t xml:space="preserve"> To characteri</w:t>
+      </w:r>
+      <w:r>
+        <w:rPr>
+          <w:rFonts w:hint="eastAsia"/>
+          <w:lang w:eastAsia="ja-JP"/>
+        </w:rPr>
+        <w:t>z</w:t>
+      </w:r>
+      <w:r>
+        <w:t>e prefectural variation in perioperative oral functional management (POFM) delivery across Japan, examine whether this variation was associated with cancer surgical demand or with dental workforce supply, and assess spatial clustering of POFM implementation.</w:t>
       </w:r>
     </w:p>
     <w:p>
@@ -1108,15 +1117,7 @@
       <w:bookmarkStart w:id="24" w:name="comparison-with-prior-studies"/>
       <w:bookmarkEnd w:id="23"/>
       <w:r>
-        <w:t xml:space="preserve">4.5 Comparison </w:t>
-      </w:r>
-      <w:proofErr w:type="gramStart"/>
-      <w:r>
-        <w:t>With</w:t>
-      </w:r>
-      <w:proofErr w:type="gramEnd"/>
-      <w:r>
-        <w:t xml:space="preserve"> Prior Studies and Health Policy Implications</w:t>
+        <w:t>4.5 Comparison With Prior Studies and Health Policy Implications</w:t>
       </w:r>
     </w:p>
     <w:p>
@@ -1303,7 +1304,7 @@
       <w:bookmarkStart w:id="31" w:name="author-contributions"/>
       <w:bookmarkEnd w:id="30"/>
       <w:r>
-        <w:t>[Author contributions are provided on the separate title page for double-anonymized peer review.]</w:t>
+        <w:t>Author Contributions</w:t>
       </w:r>
     </w:p>
     <w:p>
@@ -1311,35 +1312,30 @@
         <w:pStyle w:val="FirstParagraph"/>
         <w:rPr>
           <w:rFonts w:asciiTheme="majorHAnsi" w:hAnsiTheme="majorHAnsi" w:cstheme="majorHAnsi"/>
+          <w:sz w:val="22"/>
+          <w:szCs w:val="22"/>
         </w:rPr>
       </w:pPr>
       <w:r>
         <w:rPr>
-          <w:rFonts w:asciiTheme="majorHAnsi" w:hAnsiTheme="majorHAnsi" w:cstheme="majorHAnsi" w:hint="eastAsia"/>
+          <w:rFonts w:asciiTheme="majorHAnsi" w:hAnsiTheme="majorHAnsi" w:cstheme="majorHAnsi"/>
+          <w:sz w:val="22"/>
+          <w:szCs w:val="22"/>
+        </w:rPr>
+        <w:t>[Author 1]: Conceptualization, Data curation, Formal analysis, Investigation, Methodology, Software, Visualization, Writing – original draft, Writing – review and editing.</w:t>
+      </w:r>
+    </w:p>
+    <w:p>
+      <w:pPr>
+        <w:pStyle w:val="a0"/>
+        <w:rPr>
           <w:lang w:eastAsia="ja-JP"/>
         </w:rPr>
-      </w:r>
-      <w:r>
-        <w:rPr>
-          <w:rFonts w:asciiTheme="majorHAnsi" w:hAnsiTheme="majorHAnsi" w:cstheme="majorHAnsi"/>
-        </w:rPr>
-      </w:r>
-    </w:p>
-    <w:p>
-      <w:pPr>
-        <w:pStyle w:val="a0"/>
-        <w:rPr>
-          <w:rFonts w:hint="eastAsia"/>
-          <w:lang w:eastAsia="ja-JP"/>
-        </w:rPr>
-      </w:pPr>
-      <w:r>
-        <w:rPr>
-          <w:rFonts w:hint="eastAsia"/>
-          <w:lang w:eastAsia="ja-JP"/>
-        </w:rPr>
-      </w:r>
-      <w:r/>
+      </w:pPr>
+      <w:r>
+        <w:lastRenderedPageBreak/>
+        <w:t>[Author 2]: Conceptualization, Supervision, Writing – review and editing.</w:t>
+      </w:r>
     </w:p>
     <w:p>
       <w:pPr>
@@ -1351,7 +1347,6 @@
       <w:bookmarkStart w:id="32" w:name="funding"/>
       <w:bookmarkEnd w:id="31"/>
       <w:r>
-        <w:lastRenderedPageBreak/>
         <w:t>Funding</w:t>
       </w:r>
     </w:p>
@@ -1412,7 +1407,7 @@
       </w:r>
       <w:r>
         <w:pict w14:anchorId="5256ACE6">
-          <v:rect id="_x0000_i1051" style="width:0;height:1.5pt" o:hralign="center" o:hrstd="t" o:hr="t"/>
+          <v:rect id="_x0000_i1030" style="width:0;height:1.5pt" o:hralign="center" o:hrstd="t" o:hr="t"/>
         </w:pict>
       </w:r>
     </w:p>
@@ -1447,31 +1442,7 @@
         <w:pStyle w:val="a9"/>
       </w:pPr>
       <w:r>
-        <w:t xml:space="preserve">2. Wennberg JE, Fisher ES, Skinner JS. Geography and the debate over Medicare reform. Health Aff (Millwood). </w:t>
-      </w:r>
-      <w:proofErr w:type="gramStart"/>
-      <w:r>
-        <w:t>2002;Suppl</w:t>
-      </w:r>
-      <w:proofErr w:type="gramEnd"/>
-      <w:r>
-        <w:t xml:space="preserve"> Web </w:t>
-      </w:r>
-      <w:proofErr w:type="gramStart"/>
-      <w:r>
-        <w:t>Exclusives:W</w:t>
-      </w:r>
-      <w:proofErr w:type="gramEnd"/>
-      <w:r>
-        <w:t>96-114. doi:10.1377/</w:t>
-      </w:r>
-      <w:proofErr w:type="gramStart"/>
-      <w:r>
-        <w:t>hlthaff.w</w:t>
-      </w:r>
-      <w:proofErr w:type="gramEnd"/>
-      <w:r>
-        <w:t>2.96.</w:t>
+        <w:t>2. Wennberg JE, Fisher ES, Skinner JS. Geography and the debate over Medicare reform. Health Aff (Millwood). 2002;Suppl Web Exclusives:W96-114. doi:10.1377/hlthaff.w2.96.</w:t>
       </w:r>
     </w:p>
     <w:p>
@@ -1487,23 +1458,7 @@
         <w:pStyle w:val="a9"/>
       </w:pPr>
       <w:r>
-        <w:t>4. Wennberg JE. Time to tackle unwarranted variations in practice. BMJ. 2011;</w:t>
-      </w:r>
-      <w:proofErr w:type="gramStart"/>
-      <w:r>
-        <w:t>342:d</w:t>
-      </w:r>
-      <w:proofErr w:type="gramEnd"/>
-      <w:r>
-        <w:t>1513. doi:10.1136/</w:t>
-      </w:r>
-      <w:proofErr w:type="gramStart"/>
-      <w:r>
-        <w:t>bmj.d</w:t>
-      </w:r>
-      <w:proofErr w:type="gramEnd"/>
-      <w:r>
-        <w:t>1513.</w:t>
+        <w:t>4. Wennberg JE. Time to tackle unwarranted variations in practice. BMJ. 2011;342:d1513. doi:10.1136/bmj.d1513.</w:t>
       </w:r>
     </w:p>
     <w:p>
@@ -1513,6 +1468,7 @@
       <w:bookmarkStart w:id="34" w:name="ref-Ishimaru2018"/>
       <w:bookmarkStart w:id="35" w:name="refs"/>
       <w:r>
+        <w:lastRenderedPageBreak/>
         <w:t>5. Ishimaru M, Matsui H, Ono S, Hagiwara Y, Morita K, Yasunaga H. Preoperative oral care and effect on postoperative complications after major cancer surgery. Br J Surg. 2018;105(12):1688-96. Available from: https://pubmed.ncbi.nlm.nih.gov/30088267/</w:t>
       </w:r>
     </w:p>
@@ -1523,7 +1479,6 @@
       <w:bookmarkStart w:id="36" w:name="ref-CamusJansson2023"/>
       <w:bookmarkEnd w:id="34"/>
       <w:r>
-        <w:lastRenderedPageBreak/>
         <w:t xml:space="preserve">6. Camus-Jansson F, Longueira-Diaz N, Salinas-Diaz B, </w:t>
       </w:r>
       <w:proofErr w:type="spellStart"/>
@@ -1540,15 +1495,7 @@
       </w:r>
       <w:proofErr w:type="spellEnd"/>
       <w:r>
-        <w:t xml:space="preserve"> Oral Cir Bucal. 2023;28(3</w:t>
-      </w:r>
-      <w:proofErr w:type="gramStart"/>
-      <w:r>
-        <w:t>):e</w:t>
-      </w:r>
-      <w:proofErr w:type="gramEnd"/>
-      <w:r>
-        <w:t>217-28. Available from: https://pubmed.ncbi.nlm.nih.gov/37026607/</w:t>
+        <w:t xml:space="preserve"> Oral Cir Bucal. 2023;28(3):e217-28. Available from: https://pubmed.ncbi.nlm.nih.gov/37026607/</w:t>
       </w:r>
     </w:p>
     <w:p>
@@ -1574,15 +1521,7 @@
       </w:r>
       <w:proofErr w:type="spellEnd"/>
       <w:r>
-        <w:t xml:space="preserve"> Y. Effects of preoperative oral management by dentists on postoperative outcomes following esophagectomy: Multilevel propensity score matching and weighting analyses using the Japanese inpatient database. Medicine (Baltimore). 2019;98(17</w:t>
-      </w:r>
-      <w:proofErr w:type="gramStart"/>
-      <w:r>
-        <w:t>):e</w:t>
-      </w:r>
-      <w:proofErr w:type="gramEnd"/>
-      <w:r>
-        <w:t>15376. Available from: https://pubmed.ncbi.nlm.nih.gov/31027127/</w:t>
+        <w:t xml:space="preserve"> Y. Effects of preoperative oral management by dentists on postoperative outcomes following esophagectomy: Multilevel propensity score matching and weighting analyses using the Japanese inpatient database. Medicine (Baltimore). 2019;98(17):e15376. Available from: https://pubmed.ncbi.nlm.nih.gov/31027127/</w:t>
       </w:r>
     </w:p>
     <w:p>
@@ -1616,15 +1555,7 @@
       </w:r>
       <w:proofErr w:type="spellEnd"/>
       <w:r>
-        <w:t xml:space="preserve"> M, Hasegawa T, Komori T, Yamada SI, et al. Effect of perioperative oral care on prevention of postoperative pneumonia associated with esophageal cancer surgery: A multicenter case-control study with propensity score matching analysis. Medicine (Baltimore). 2017;96(33</w:t>
-      </w:r>
-      <w:proofErr w:type="gramStart"/>
-      <w:r>
-        <w:t>):e</w:t>
-      </w:r>
-      <w:proofErr w:type="gramEnd"/>
-      <w:r>
-        <w:t>7436. Available from: https://pubmed.ncbi.nlm.nih.gov/28816937/</w:t>
+        <w:t xml:space="preserve"> M, Hasegawa T, Komori T, Yamada SI, et al. Effect of perioperative oral care on prevention of postoperative pneumonia associated with esophageal cancer surgery: A multicenter case-control study with propensity score matching analysis. Medicine (Baltimore). 2017;96(33):e7436. Available from: https://pubmed.ncbi.nlm.nih.gov/28816937/</w:t>
       </w:r>
     </w:p>
     <w:p>
@@ -1634,15 +1565,7 @@
       <w:bookmarkStart w:id="39" w:name="ref-Iwata2019"/>
       <w:bookmarkEnd w:id="38"/>
       <w:r>
-        <w:t xml:space="preserve">9. Iwata E, Hasegawa T, Yamada SI, Kawashita Y, Yoshimatsu M, Mizutani T, et al. Effects of perioperative oral care on prevention of postoperative pneumonia after lung resection: Multicenter retrospective study with propensity </w:t>
-      </w:r>
-      <w:proofErr w:type="gramStart"/>
-      <w:r>
-        <w:t>score</w:t>
-      </w:r>
-      <w:proofErr w:type="gramEnd"/>
-      <w:r>
-        <w:t xml:space="preserve"> matching analysis. Surgery. 2019;165(5):1003-7. Available from: https://pubmed.ncbi.nlm.nih.gov/30765141/</w:t>
+        <w:t>9. Iwata E, Hasegawa T, Yamada SI, Kawashita Y, Yoshimatsu M, Mizutani T, et al. Effects of perioperative oral care on prevention of postoperative pneumonia after lung resection: Multicenter retrospective study with propensity score matching analysis. Surgery. 2019;165(5):1003-7. Available from: https://pubmed.ncbi.nlm.nih.gov/30765141/</w:t>
       </w:r>
     </w:p>
     <w:p>
@@ -1692,15 +1615,7 @@
       </w:r>
       <w:proofErr w:type="spellEnd"/>
       <w:r>
-        <w:t xml:space="preserve"> S, et al. Effect of perioperative oral management on the prevention of surgical site infection after colorectal cancer surgery: A multicenter retrospective analysis of 698 patients via analysis of covariance using propensity score. Medicine (Baltimore). 2018;97(40</w:t>
-      </w:r>
-      <w:proofErr w:type="gramStart"/>
-      <w:r>
-        <w:t>):e</w:t>
-      </w:r>
-      <w:proofErr w:type="gramEnd"/>
-      <w:r>
-        <w:t>12545. Available from: https://pubmed.ncbi.nlm.nih.gov/30290611/</w:t>
+        <w:t xml:space="preserve"> S, et al. Effect of perioperative oral management on the prevention of surgical site infection after colorectal cancer surgery: A multicenter retrospective analysis of 698 patients via analysis of covariance using propensity score. Medicine (Baltimore). 2018;97(40):e12545. Available from: https://pubmed.ncbi.nlm.nih.gov/30290611/</w:t>
       </w:r>
     </w:p>
     <w:p>
@@ -1738,7 +1653,11 @@
       <w:bookmarkStart w:id="43" w:name="ref-Kodama2021"/>
       <w:bookmarkEnd w:id="42"/>
       <w:r>
-        <w:t>13. Kodama T, Ida Y, Oshima K, Miura H. Are public oral care services evenly distributed? Nation-wide assessment of the provision of oral care in Japan using the national database of health insurance claims. Int J Environ Res Public Health. 2021;18(20):10850.</w:t>
+        <w:t xml:space="preserve">13. Kodama T, Ida Y, Oshima K, Miura H. Are public oral care services evenly distributed? Nation-wide assessment of the provision of oral care in Japan using the </w:t>
+      </w:r>
+      <w:r>
+        <w:lastRenderedPageBreak/>
+        <w:t>national database of health insurance claims. Int J Environ Res Public Health. 2021;18(20):10850.</w:t>
       </w:r>
     </w:p>
     <w:p>
@@ -1748,7 +1667,6 @@
       <w:bookmarkStart w:id="44" w:name="ref-Ishimaru2022b"/>
       <w:bookmarkEnd w:id="43"/>
       <w:r>
-        <w:lastRenderedPageBreak/>
         <w:t xml:space="preserve">14. Ishimaru M, Taira K, </w:t>
       </w:r>
       <w:proofErr w:type="spellStart"/>
@@ -1767,15 +1685,7 @@
       <w:bookmarkStart w:id="45" w:name="ref-Nomura2021"/>
       <w:bookmarkEnd w:id="44"/>
       <w:r>
-        <w:t xml:space="preserve">15. Nomura Y, Ohara Y, Yamamoto Y, Okada A, Hosoya N, Hanada N, et al. Dental hygienists’ practice in perioperative oral care management according to the Japanese dental </w:t>
-      </w:r>
-      <w:proofErr w:type="gramStart"/>
-      <w:r>
-        <w:t>hygienists</w:t>
-      </w:r>
-      <w:proofErr w:type="gramEnd"/>
-      <w:r>
-        <w:t xml:space="preserve"> survey 2019. Int J Environ Res Public Health. 2021;18(1):114. Available from: https://pubmed.ncbi.nlm.nih.gov/33375276/</w:t>
+        <w:t>15. Nomura Y, Ohara Y, Yamamoto Y, Okada A, Hosoya N, Hanada N, et al. Dental hygienists’ practice in perioperative oral care management according to the Japanese dental hygienists survey 2019. Int J Environ Res Public Health. 2021;18(1):114. Available from: https://pubmed.ncbi.nlm.nih.gov/33375276/</w:t>
       </w:r>
     </w:p>
     <w:p>
@@ -1793,23 +1703,7 @@
       </w:r>
       <w:proofErr w:type="spellEnd"/>
       <w:r>
-        <w:t xml:space="preserve"> M, Sakata N, Watanabe T, et al. </w:t>
-      </w:r>
-      <w:proofErr w:type="gramStart"/>
-      <w:r>
-        <w:t>Regional</w:t>
-      </w:r>
-      <w:proofErr w:type="gramEnd"/>
-      <w:r>
-        <w:t xml:space="preserve"> inequality in dental care utilization in Japan: An ecological study using the national database of health insurance claims. Lancet Reg Health West Pac. </w:t>
-      </w:r>
-      <w:proofErr w:type="gramStart"/>
-      <w:r>
-        <w:t>2021;12:100170</w:t>
-      </w:r>
-      <w:proofErr w:type="gramEnd"/>
-      <w:r>
-        <w:t>.</w:t>
+        <w:t xml:space="preserve"> M, Sakata N, Watanabe T, et al. Regional inequality in dental care utilization in Japan: An ecological study using the national database of health insurance claims. Lancet Reg Health West Pac. 2021;12:100170.</w:t>
       </w:r>
     </w:p>
     <w:p>
@@ -1939,6 +1833,7 @@
       <w:bookmarkStart w:id="55" w:name="ref-Ibuka2020"/>
       <w:bookmarkEnd w:id="54"/>
       <w:r>
+        <w:lastRenderedPageBreak/>
         <w:t xml:space="preserve">25. Ibuka Y, Matsuda Y, Shoji K, Ishigaki T. Evaluation of regional variations in healthcare utilization. </w:t>
       </w:r>
       <w:proofErr w:type="spellStart"/>
@@ -1957,7 +1852,6 @@
       <w:bookmarkStart w:id="56" w:name="ref-Seo2022"/>
       <w:bookmarkEnd w:id="55"/>
       <w:r>
-        <w:lastRenderedPageBreak/>
         <w:t xml:space="preserve">26. Seo Y, </w:t>
       </w:r>
       <w:proofErr w:type="spellStart"/>
@@ -2010,15 +1904,7 @@
       </w:r>
       <w:proofErr w:type="spellEnd"/>
       <w:r>
-        <w:t xml:space="preserve"> S, Matsumoto T, Yoshimatsu Y, Matsumoto S, et al. Current state and challenges of dental intervention in aspiration pneumonia management from the perspective of hospitalists: A cross-sectional survey in Japan. Int J Gen Med. </w:t>
-      </w:r>
-      <w:proofErr w:type="gramStart"/>
-      <w:r>
-        <w:t>2025;18:6889</w:t>
-      </w:r>
-      <w:proofErr w:type="gramEnd"/>
-      <w:r>
-        <w:t>-98.</w:t>
+        <w:t xml:space="preserve"> S, Matsumoto T, Yoshimatsu Y, Matsumoto S, et al. Current state and challenges of dental intervention in aspiration pneumonia management from the perspective of hospitalists: A cross-sectional survey in Japan. Int J Gen Med. 2025;18:6889-98.</w:t>
       </w:r>
     </w:p>
     <w:p>
@@ -2044,15 +1930,7 @@
       </w:r>
       <w:proofErr w:type="spellEnd"/>
       <w:r>
-        <w:t xml:space="preserve"> Y, Saito R. Geographic variation in inpatient medical expenditure among older adults aged 75 years and above in Japan: A three-level multilevel analysis of nationwide data. Front Public Health. </w:t>
-      </w:r>
-      <w:proofErr w:type="gramStart"/>
-      <w:r>
-        <w:t>2024;12:1306013</w:t>
-      </w:r>
-      <w:proofErr w:type="gramEnd"/>
-      <w:r>
-        <w:t>.</w:t>
+        <w:t xml:space="preserve"> Y, Saito R. Geographic variation in inpatient medical expenditure among older adults aged 75 years and above in Japan: A three-level multilevel analysis of nationwide data. Front Public Health. 2024;12:1306013.</w:t>
       </w:r>
     </w:p>
     <w:p>
@@ -2150,15 +2028,7 @@
       </w:r>
       <w:proofErr w:type="spellEnd"/>
       <w:r>
-        <w:t xml:space="preserve"> One. 2023;18(10</w:t>
-      </w:r>
-      <w:proofErr w:type="gramStart"/>
-      <w:r>
-        <w:t>):e</w:t>
-      </w:r>
-      <w:proofErr w:type="gramEnd"/>
-      <w:r>
-        <w:t>0292547.</w:t>
+        <w:t xml:space="preserve"> One. 2023;18(10):e0292547.</w:t>
       </w:r>
     </w:p>
     <w:p>
@@ -2168,15 +2038,7 @@
       <w:bookmarkStart w:id="65" w:name="ref-Morgenstern1998"/>
       <w:bookmarkEnd w:id="64"/>
       <w:r>
-        <w:t xml:space="preserve">35. Morgenstern H. Ecologic studies in epidemiology: Concepts, principles, and methods. Annu Rev Public Health. </w:t>
-      </w:r>
-      <w:proofErr w:type="gramStart"/>
-      <w:r>
-        <w:t>1995;16:61</w:t>
-      </w:r>
-      <w:proofErr w:type="gramEnd"/>
-      <w:r>
-        <w:t>-81. Available from: https://pubmed.ncbi.nlm.nih.gov/7639884/</w:t>
+        <w:t>35. Morgenstern H. Ecologic studies in epidemiology: Concepts, principles, and methods. Annu Rev Public Health. 1995;16:61-81. Available from: https://pubmed.ncbi.nlm.nih.gov/7639884/</w:t>
       </w:r>
     </w:p>
     <w:p>
@@ -2186,6 +2048,7 @@
       <w:bookmarkStart w:id="66" w:name="ref-Greenland2001"/>
       <w:bookmarkEnd w:id="65"/>
       <w:r>
+        <w:lastRenderedPageBreak/>
         <w:t>36. Greenland S. Ecologic versus individual-level sources of bias in ecologic estimates of contextual health effects. Int J Epidemiol. 2001;30(6):1343-50. Available from: https://pubmed.ncbi.nlm.nih.gov/11821344/</w:t>
       </w:r>
     </w:p>
@@ -2194,7 +2057,7 @@
     <w:p>
       <w:r>
         <w:pict w14:anchorId="6233C4C6">
-          <v:rect id="_x0000_i1052" style="width:0;height:1.5pt" o:hralign="center" o:hrstd="t" o:hr="t"/>
+          <v:rect id="_x0000_i1031" style="width:0;height:1.5pt" o:hralign="center" o:hrstd="t" o:hr="t"/>
         </w:pict>
       </w:r>
     </w:p>
@@ -2204,7 +2067,6 @@
         <w:pStyle w:val="1"/>
       </w:pPr>
       <w:r>
-        <w:lastRenderedPageBreak/>
         <w:t>Tables</w:t>
       </w:r>
     </w:p>

</xml_diff>

<commit_message>
fix: sync US spelling and blinded Author Contributions in submission DOCX
Update anonymous manuscript (characterize, [Author 1]/[Author 2]), align submission prep scripts, and fix flake8 W391 in scripts 02 and 04.

Co-authored-by: Cursor <cursoragent@cursor.com>
</commit_message>
<xml_diff>
--- a/04_Manuscripts/10Manuscript_health_policy_submission_v1_anonymous.docx
+++ b/04_Manuscripts/10Manuscript_health_policy_submission_v1_anonymous.docx
@@ -188,15 +188,17 @@
     </w:p>
     <w:p>
       <w:r>
-        <w:t xml:space="preserve">Universal health coverage aims to ensure that evidence-based care reaches patients according to clinical need. Japan incorporated perioperative oral functional management (POFM) into its national health insurance fee schedule in 2012, with further reimbursement expansion in 2020 and 2022. Prior studies have documented postoperative benefits of POFM at the patient and hospital level, but prefecture-level variation in POFM implementation had not been </w:t>
-      </w:r>
-      <w:proofErr w:type="spellStart"/>
-      <w:r>
-        <w:t>characterised</w:t>
-      </w:r>
-      <w:proofErr w:type="spellEnd"/>
-      <w:r>
-        <w:t>.</w:t>
+        <w:t>Universal health coverage aims to ensure that evidence-based care reaches patients according to clinical need. Japan incorporated perioperative oral functional management (POFM) into its national health insurance fee schedule in 2012, with further reimbursement expansion in 2020 and 2022. Prior studies have documented postoperative benefits of POFM at the patient and hospital level, but prefecture-level variation in POFM implementation had not been characteri</w:t>
+      </w:r>
+      <w:r>
+        <w:rPr>
+          <w:rFonts w:hint="eastAsia"/>
+          <w:lang w:eastAsia="ja-JP"/>
+        </w:rPr>
+        <w:t>z</w:t>
+      </w:r>
+      <w:r>
+        <w:t>ed.</w:t>
       </w:r>
     </w:p>
     <w:p>
@@ -590,6 +592,7 @@
       <w:bookmarkStart w:id="11" w:name="spatial-analysis"/>
       <w:bookmarkEnd w:id="10"/>
       <w:r>
+        <w:lastRenderedPageBreak/>
         <w:t>2.3.3 Spatial Analysis</w:t>
       </w:r>
     </w:p>
@@ -598,11 +601,7 @@
         <w:pStyle w:val="FirstParagraph"/>
       </w:pPr>
       <w:r>
-        <w:t xml:space="preserve">Global Moran’s I tested spatial autocorrelation in POFM density. Lagrange Multiplier tests guided spatial model selection. A Spatial Lag Model (SLM) was selected when </w:t>
-      </w:r>
-      <w:r>
-        <w:lastRenderedPageBreak/>
-        <w:t>spatial lag dependence was supported [21,22]. Local Moran’s I (LISA) identified High-High and Low-Low clusters [20].</w:t>
+        <w:t>Global Moran’s I tested spatial autocorrelation in POFM density. Lagrange Multiplier tests guided spatial model selection. A Spatial Lag Model (SLM) was selected when spatial lag dependence was supported [21,22]. Local Moran’s I (LISA) identified High-High and Low-Low clusters [20].</w:t>
       </w:r>
     </w:p>
     <w:p>
@@ -742,7 +741,11 @@
         <w:pStyle w:val="FirstParagraph"/>
       </w:pPr>
       <w:r>
-        <w:t>The POFM density map (Figure 3) showed clustering, with higher densities in Tokai and western Japan and lower densities in Hokkaido and parts of Tohoku. The cancer surgery density map (Supplementary Figure S1) showed a different pattern, with the highest surgical volumes in urban prefectures such as Tokyo, Osaka, and Aichi.</w:t>
+        <w:t xml:space="preserve">The POFM density map (Figure 3) showed clustering, with higher densities in Tokai and western Japan and lower densities in Hokkaido and parts of Tohoku. The cancer </w:t>
+      </w:r>
+      <w:r>
+        <w:lastRenderedPageBreak/>
+        <w:t>surgery density map (Supplementary Figure S1) showed a different pattern, with the highest surgical volumes in urban prefectures such as Tokyo, Osaka, and Aichi.</w:t>
       </w:r>
     </w:p>
     <w:p>
@@ -760,7 +763,6 @@
       <w:bookmarkStart w:id="16" w:name="Xda1057937d0ed8cc33f4b376fb12b3e67d47e70"/>
       <w:bookmarkEnd w:id="15"/>
       <w:r>
-        <w:lastRenderedPageBreak/>
         <w:t>3.3 Association Between Cancer Surgery Density and POFM Density</w:t>
       </w:r>
     </w:p>
@@ -897,6 +899,7 @@
         <w:pStyle w:val="a0"/>
       </w:pPr>
       <w:r>
+        <w:lastRenderedPageBreak/>
         <w:t>LISA identified three High-High clusters in western Japan (Hyogo, Okayama, Saga) and three Low-Low clusters (Hokkaido, Iwate, Okinawa; Figure 6). No High-Low or significant Low-High clusters were detected.</w:t>
       </w:r>
     </w:p>
@@ -905,7 +908,6 @@
         <w:pStyle w:val="a0"/>
       </w:pPr>
       <w:r>
-        <w:lastRenderedPageBreak/>
         <w:t>(See Figure 6)</w:t>
       </w:r>
     </w:p>
@@ -1001,6 +1003,7 @@
       <w:bookmarkStart w:id="22" w:name="spatial-regression-and-lisa-clustering"/>
       <w:bookmarkEnd w:id="21"/>
       <w:r>
+        <w:lastRenderedPageBreak/>
         <w:t>4.3 Spatial Diffusion of Supply-Driven Implementation</w:t>
       </w:r>
     </w:p>
@@ -1009,11 +1012,7 @@
         <w:pStyle w:val="FirstParagraph"/>
       </w:pPr>
       <w:r>
-        <w:t xml:space="preserve">The significant spatial autoregressive coefficient (ρ = 0.354, p = 0.002) indicates that POFM uptake was spatially patterned. This is compatible with regional diffusion </w:t>
-      </w:r>
-      <w:r>
-        <w:lastRenderedPageBreak/>
-        <w:t>through professional networks, dental school outreach, and shared hospital dentistry staff pools, although these mechanisms were not directly measured [14,16,25,26].</w:t>
+        <w:t>The significant spatial autoregressive coefficient (ρ = 0.354, p = 0.002) indicates that POFM uptake was spatially patterned. This is compatible with regional diffusion through professional networks, dental school outreach, and shared hospital dentistry staff pools, although these mechanisms were not directly measured [14,16,25,26].</w:t>
       </w:r>
     </w:p>
     <w:p>
@@ -1125,7 +1124,11 @@
         <w:pStyle w:val="FirstParagraph"/>
       </w:pPr>
       <w:r>
-        <w:t>Prior Japanese studies have examined POFM mainly at the hospital or patient level and documented postoperative benefits (5,7-10). This study adds a macro-level health services perspective: even nationally reimbursed evidence-based care may remain supply-sensitive. POFM may therefore function as a case study of supply-driven implementation within universal health insurance.</w:t>
+        <w:t xml:space="preserve">Prior Japanese studies have examined POFM mainly at the hospital or patient level and documented postoperative benefits (5,7-10). This study adds a macro-level </w:t>
+      </w:r>
+      <w:r>
+        <w:lastRenderedPageBreak/>
+        <w:t>health services perspective: even nationally reimbursed evidence-based care may remain supply-sensitive. POFM may therefore function as a case study of supply-driven implementation within universal health insurance.</w:t>
       </w:r>
     </w:p>
     <w:p>
@@ -1133,7 +1136,6 @@
         <w:pStyle w:val="FirstParagraph"/>
       </w:pPr>
       <w:r>
-        <w:lastRenderedPageBreak/>
         <w:t>The implications may extend beyond perioperative oral care. Other multidisciplinary services requiring cross-professional coordination may similarly depend on local implementation capacity rather than clinical need alone.</w:t>
       </w:r>
     </w:p>
@@ -1202,11 +1204,11 @@
         <w:pStyle w:val="FirstParagraph"/>
       </w:pPr>
       <w:r>
-        <w:t xml:space="preserve">Beyond Japan, these findings carry implications for health systems considering the introduction of perioperative oral care reimbursement. As POFM efficacy in reducing postoperative complications is well established (5–11), reimbursement may increasingly be adopted internationally. However, this study suggests that coverage alone may be insufficient: parallel investment in dental workforce development, hospital-dental integration, referral pathway infrastructure, and multidisciplinary care </w:t>
+        <w:t xml:space="preserve">Beyond Japan, these findings carry implications for health systems considering the introduction of perioperative oral care reimbursement. As POFM efficacy in reducing postoperative complications is well established (5–11), reimbursement may </w:t>
       </w:r>
       <w:r>
         <w:lastRenderedPageBreak/>
-        <w:t>routines may be equally necessary to translate formal eligibility into equitable access to evidence-based perioperative care.</w:t>
+        <w:t>increasingly be adopted internationally. However, this study suggests that coverage alone may be insufficient: parallel investment in dental workforce development, hospital-dental integration, referral pathway infrastructure, and multidisciplinary care routines may be equally necessary to translate formal eligibility into equitable access to evidence-based perioperative care.</w:t>
       </w:r>
     </w:p>
     <w:p>
@@ -1304,6 +1306,7 @@
       <w:bookmarkStart w:id="31" w:name="author-contributions"/>
       <w:bookmarkEnd w:id="30"/>
       <w:r>
+        <w:lastRenderedPageBreak/>
         <w:t>Author Contributions</w:t>
       </w:r>
     </w:p>
@@ -1333,7 +1336,6 @@
         </w:rPr>
       </w:pPr>
       <w:r>
-        <w:lastRenderedPageBreak/>
         <w:t>[Author 2]: Conceptualization, Supervision, Writing – review and editing.</w:t>
       </w:r>
     </w:p>
@@ -1458,6 +1460,7 @@
         <w:pStyle w:val="a9"/>
       </w:pPr>
       <w:r>
+        <w:lastRenderedPageBreak/>
         <w:t>4. Wennberg JE. Time to tackle unwarranted variations in practice. BMJ. 2011;342:d1513. doi:10.1136/bmj.d1513.</w:t>
       </w:r>
     </w:p>
@@ -1468,7 +1471,6 @@
       <w:bookmarkStart w:id="34" w:name="ref-Ishimaru2018"/>
       <w:bookmarkStart w:id="35" w:name="refs"/>
       <w:r>
-        <w:lastRenderedPageBreak/>
         <w:t>5. Ishimaru M, Matsui H, Ono S, Hagiwara Y, Morita K, Yasunaga H. Preoperative oral care and effect on postoperative complications after major cancer surgery. Br J Surg. 2018;105(12):1688-96. Available from: https://pubmed.ncbi.nlm.nih.gov/30088267/</w:t>
       </w:r>
     </w:p>
@@ -1653,11 +1655,8 @@
       <w:bookmarkStart w:id="43" w:name="ref-Kodama2021"/>
       <w:bookmarkEnd w:id="42"/>
       <w:r>
-        <w:t xml:space="preserve">13. Kodama T, Ida Y, Oshima K, Miura H. Are public oral care services evenly distributed? Nation-wide assessment of the provision of oral care in Japan using the </w:t>
-      </w:r>
-      <w:r>
         <w:lastRenderedPageBreak/>
-        <w:t>national database of health insurance claims. Int J Environ Res Public Health. 2021;18(20):10850.</w:t>
+        <w:t>13. Kodama T, Ida Y, Oshima K, Miura H. Are public oral care services evenly distributed? Nation-wide assessment of the provision of oral care in Japan using the national database of health insurance claims. Int J Environ Res Public Health. 2021;18(20):10850.</w:t>
       </w:r>
     </w:p>
     <w:p>
@@ -1823,6 +1822,7 @@
       <w:bookmarkStart w:id="54" w:name="ref-Greenhalgh2004"/>
       <w:bookmarkEnd w:id="53"/>
       <w:r>
+        <w:lastRenderedPageBreak/>
         <w:t>24. Greenhalgh T, Robert G, Macfarlane F, Bate P, Kyriakidou O. Diffusion of innovations in service organizations: Systematic review and recommendations. Milbank Q. 2004;82(4):581-629.</w:t>
       </w:r>
     </w:p>
@@ -1833,7 +1833,6 @@
       <w:bookmarkStart w:id="55" w:name="ref-Ibuka2020"/>
       <w:bookmarkEnd w:id="54"/>
       <w:r>
-        <w:lastRenderedPageBreak/>
         <w:t xml:space="preserve">25. Ibuka Y, Matsuda Y, Shoji K, Ishigaki T. Evaluation of regional variations in healthcare utilization. </w:t>
       </w:r>
       <w:proofErr w:type="spellStart"/>
@@ -2038,6 +2037,7 @@
       <w:bookmarkStart w:id="65" w:name="ref-Morgenstern1998"/>
       <w:bookmarkEnd w:id="64"/>
       <w:r>
+        <w:lastRenderedPageBreak/>
         <w:t>35. Morgenstern H. Ecologic studies in epidemiology: Concepts, principles, and methods. Annu Rev Public Health. 1995;16:61-81. Available from: https://pubmed.ncbi.nlm.nih.gov/7639884/</w:t>
       </w:r>
     </w:p>
@@ -2048,7 +2048,6 @@
       <w:bookmarkStart w:id="66" w:name="ref-Greenland2001"/>
       <w:bookmarkEnd w:id="65"/>
       <w:r>
-        <w:lastRenderedPageBreak/>
         <w:t>36. Greenland S. Ecologic versus individual-level sources of bias in ecologic estimates of contextual health effects. Int J Epidemiol. 2001;30(6):1343-50. Available from: https://pubmed.ncbi.nlm.nih.gov/11821344/</w:t>
       </w:r>
     </w:p>
@@ -2920,6 +2919,7 @@
         <w:pStyle w:val="FirstParagraph"/>
       </w:pPr>
       <w:r>
+        <w:lastRenderedPageBreak/>
         <w:t>Figure 3: Prefectural distribution of perioperative oral management (POFM) density (B001-2 + B001-3 claim counts per 100,000 population, FY2023).</w:t>
       </w:r>
     </w:p>
@@ -2931,7 +2931,6 @@
         <w:rPr>
           <w:noProof/>
         </w:rPr>
-        <w:lastRenderedPageBreak/>
         <w:drawing>
           <wp:inline distT="0" distB="0" distL="0" distR="0" wp14:anchorId="449E1F68" wp14:editId="0127A177">
             <wp:extent cx="4267200" cy="3606997"/>

</xml_diff>

<commit_message>
feat: add EM submission package builder and finalize anonymous DOCX
- Add build_submission_package.py: assembles all EM upload files into submission_package/
- Add EM_submission_guide_HEALTH_POLICY.md: step-by-step Editorial Manager upload instructions
- Add highlights_health_policy.docx: Health Policy Highlights as standalone DOCX
- Add fix_ref_order_20_22.py: script to fix reference numbering (refs 20-22)
- Update anonymous submission DOCX with US spelling sync and blinded Author Contributions
- Add 02_Data/master/ placeholder CSVs (facility_survey_2022, population_2023)
- Update .gitignore to exclude submission_package/ (local-only, regenerable)

Co-Authored-By: Claude Sonnet 4.6 <noreply@anthropic.com>
</commit_message>
<xml_diff>
--- a/04_Manuscripts/10Manuscript_health_policy_submission_v1_anonymous.docx
+++ b/04_Manuscripts/10Manuscript_health_policy_submission_v1_anonymous.docx
@@ -247,7 +247,23 @@
         <w:pStyle w:val="FirstParagraph"/>
       </w:pPr>
       <w:r>
-        <w:t>Healthcare systems aim to allocate evidence-based care according to patient need. However, regional healthcare delivery often reflects provider availability, institutional capacity, and local practice patterns rather than need alone (1–4). This gap between need-driven allocation and supply-sensitive delivery has been central to the literature on unwarranted geographic variation in healthcare, but has been less often examined for dental-medical integration within universal health insurance systems.</w:t>
+        <w:t xml:space="preserve">Healthcare systems aim to allocate evidence-based care according to patient need. However, regional healthcare delivery often reflects provider availability, institutional capacity, and local practice patterns rather than need alone </w:t>
+      </w:r>
+      <w:r>
+        <w:rPr>
+          <w:rFonts w:hint="eastAsia"/>
+          <w:lang w:eastAsia="ja-JP"/>
+        </w:rPr>
+        <w:t>[</w:t>
+      </w:r>
+      <w:r>
+        <w:t>1–4</w:t>
+      </w:r>
+      <w:r>
+        <w:t>]</w:t>
+      </w:r>
+      <w:r>
+        <w:t>. This gap between need-driven allocation and supply-sensitive delivery has been central to the literature on unwarranted geographic variation in healthcare, but has been less often examined for dental-medical integration within universal health insurance systems.</w:t>
       </w:r>
     </w:p>
     <w:p>
@@ -255,7 +271,23 @@
         <w:pStyle w:val="a0"/>
       </w:pPr>
       <w:r>
-        <w:t>Perioperative oral functional management (POFM) is an evidence-based practice that reduces postoperative complications such as aspiration pneumonia, surgical site infections, and mucositis in patients undergoing major surgery, radiotherapy, or chemotherapy (5–11). In Japan, POFM has been incorporated into the national health insurance fee schedule since 2012 and was further expanded in the 2020 and 2022 diagnostic fee revisions to include a broader range of surgical and oncological indications [12]. In principle, such nationwide reimbursement should support need-based access.</w:t>
+        <w:t xml:space="preserve">Perioperative oral functional management (POFM) is an evidence-based practice that reduces postoperative complications such as aspiration pneumonia, surgical site infections, and mucositis in patients undergoing major surgery, radiotherapy, or chemotherapy </w:t>
+      </w:r>
+      <w:r>
+        <w:rPr>
+          <w:rFonts w:hint="eastAsia"/>
+          <w:lang w:eastAsia="ja-JP"/>
+        </w:rPr>
+        <w:t>[</w:t>
+      </w:r>
+      <w:r>
+        <w:t>5–11</w:t>
+      </w:r>
+      <w:r>
+        <w:t>]</w:t>
+      </w:r>
+      <w:r>
+        <w:t>. In Japan, POFM has been incorporated into the national health insurance fee schedule since 2012 and was further expanded in the 2020 and 2022 diagnostic fee revisions to include a broader range of surgical and oncological indications [12]. In principle, such nationwide reimbursement should support need-based access.</w:t>
       </w:r>
     </w:p>
     <w:p>
@@ -263,7 +295,23 @@
         <w:pStyle w:val="a0"/>
       </w:pPr>
       <w:r>
-        <w:t>In practice, however, POFM delivery may depend not only on the number of eligible surgical patients but also on whether local health systems have the dental workforce, hospital dental departments, referral pathways, and multidisciplinary routines needed to deliver the service (13–16). This distinction is important because universal coverage creates formal eligibility, but implementation capacity determines whether evidence-based care actually reaches patients.</w:t>
+        <w:t xml:space="preserve">In practice, however, POFM delivery may depend not only on the number of eligible surgical patients but also on whether local health systems have the dental workforce, hospital dental departments, referral pathways, and multidisciplinary routines needed to deliver the service </w:t>
+      </w:r>
+      <w:r>
+        <w:rPr>
+          <w:rFonts w:hint="eastAsia"/>
+          <w:lang w:eastAsia="ja-JP"/>
+        </w:rPr>
+        <w:t>[</w:t>
+      </w:r>
+      <w:r>
+        <w:t>13–16</w:t>
+      </w:r>
+      <w:r>
+        <w:t>]</w:t>
+      </w:r>
+      <w:r>
+        <w:t>. This distinction is important because universal coverage creates formal eligibility, but implementation capacity determines whether evidence-based care actually reaches patients.</w:t>
       </w:r>
     </w:p>
     <w:p>
@@ -423,15 +471,17 @@
         <w:pStyle w:val="FirstParagraph"/>
       </w:pPr>
       <w:r>
-        <w:t xml:space="preserve">where B001-2 (Perioperative Oral Functional Management Fee I) and B001-3 (Perioperative Oral Functional Management Fee II) are the dental management procedure codes covering the pre-operative assessment, intraoperative support, and post-operative management phases of POFM in the Japanese dental fee schedule. These codes are billed recurrently throughout the perioperative period; the density metric reflects the aggregate </w:t>
-      </w:r>
-      <w:proofErr w:type="spellStart"/>
-      <w:r>
-        <w:t>utilisation</w:t>
-      </w:r>
-      <w:proofErr w:type="spellEnd"/>
-      <w:r>
-        <w:t xml:space="preserve"> intensity across all POFM-eligible patients (including cancer surgery, chemotherapy, and radiation therapy patients) in each prefecture.</w:t>
+        <w:t>where B001-2 (Perioperative Oral Functional Management Fee I) and B001-3 (Perioperative Oral Functional Management Fee II) are the dental management procedure codes covering the pre-operative assessment, intraoperative support, and post-operative management phases of POFM in the Japanese dental fee schedule. These codes are billed recurrently throughout the perioperative period; the density metric reflects the aggregate utili</w:t>
+      </w:r>
+      <w:r>
+        <w:rPr>
+          <w:rFonts w:hint="eastAsia"/>
+          <w:lang w:eastAsia="ja-JP"/>
+        </w:rPr>
+        <w:t>z</w:t>
+      </w:r>
+      <w:r>
+        <w:t>ation intensity across all POFM-eligible patients (including cancer surgery, chemotherapy, and radiation therapy patients) in each prefecture.</w:t>
       </w:r>
     </w:p>
     <w:p>
@@ -449,7 +499,23 @@
         <w:pStyle w:val="FirstParagraph"/>
       </w:pPr>
       <w:r>
-        <w:t>The exposure was major cancer surgery density, defined as annual claims for 16 representative cancer surgery K-codes per 100,000 population. These 16 K-codes were selected to represent the principal oncological surgical procedures for which perioperative dental assessment and POFM referral are routinely recommended under the Japanese national health insurance fee schedule, encompassing the major cancer surgery types for which B001-2/3 claims are most frequently generated (5,7–11). Because POFM eligibility also extends to chemotherapy and radiotherapy patients, cancer surgery density should be regarded as a pragmatic demand-side proxy rather than a comprehensive measure of total POFM-eligible need.</w:t>
+        <w:t xml:space="preserve">The exposure was major cancer surgery density, defined as annual claims for 16 representative cancer surgery K-codes per 100,000 population. These 16 K-codes were selected to represent the principal oncological surgical procedures for which perioperative dental assessment and POFM referral are routinely recommended under the Japanese national health insurance fee schedule, encompassing the major cancer surgery types for which B001-2/3 claims are most frequently generated </w:t>
+      </w:r>
+      <w:r>
+        <w:rPr>
+          <w:rFonts w:hint="eastAsia"/>
+          <w:lang w:eastAsia="ja-JP"/>
+        </w:rPr>
+        <w:t>[</w:t>
+      </w:r>
+      <w:r>
+        <w:t>5,7–11</w:t>
+      </w:r>
+      <w:r>
+        <w:t>]</w:t>
+      </w:r>
+      <w:r>
+        <w:t>. Because POFM eligibility also extends to chemotherapy and radiotherapy patients, cancer surgery density should be regarded as a pragmatic demand-side proxy rather than a comprehensive measure of total POFM-eligible need.</w:t>
       </w:r>
     </w:p>
     <w:p>
@@ -592,16 +658,19 @@
       <w:bookmarkStart w:id="11" w:name="spatial-analysis"/>
       <w:bookmarkEnd w:id="10"/>
       <w:r>
+        <w:t>2.3.3 Spatial Analysis</w:t>
+      </w:r>
+    </w:p>
+    <w:p>
+      <w:pPr>
+        <w:pStyle w:val="FirstParagraph"/>
+      </w:pPr>
+      <w:r>
+        <w:t xml:space="preserve">Global Moran’s I tested spatial autocorrelation in POFM density. Lagrange Multiplier tests guided spatial model selection. A Spatial Lag Model (SLM) was selected when </w:t>
+      </w:r>
+      <w:r>
         <w:lastRenderedPageBreak/>
-        <w:t>2.3.3 Spatial Analysis</w:t>
-      </w:r>
-    </w:p>
-    <w:p>
-      <w:pPr>
-        <w:pStyle w:val="FirstParagraph"/>
-      </w:pPr>
-      <w:r>
-        <w:t>Global Moran’s I tested spatial autocorrelation in POFM density. Lagrange Multiplier tests guided spatial model selection. A Spatial Lag Model (SLM) was selected when spatial lag dependence was supported [21,22]. Local Moran’s I (LISA) identified High-High and Low-Low clusters [20].</w:t>
+        <w:t>spatial lag dependence was supported [20,21]. Local Moran’s I (LISA) identified High-High and Low-Low clusters [22].</w:t>
       </w:r>
     </w:p>
     <w:p>
@@ -609,7 +678,7 @@
         <w:pStyle w:val="a0"/>
       </w:pPr>
       <w:r>
-        <w:t>Local spatial clustering was examined using Local Indicators of Spatial Association (LISA; Local Moran’s I) with 999 permutations, classifying significant prefectures (p &lt; 0.05) into High-High (HH), Low-High (LH), Low-Low (LL), or High-Low (HL) clusters [20].</w:t>
+        <w:t>Local spatial clustering was examined using Local Indicators of Spatial Association (LISA; Local Moran’s I) with 999 permutations, classifying significant prefectures (p &lt; 0.05) into High-High (HH), Low-High (LH), Low-Low (LL), or High-Low (HL) clusters [22].</w:t>
       </w:r>
     </w:p>
     <w:p>
@@ -635,7 +704,17 @@
         <w:pStyle w:val="a0"/>
       </w:pPr>
       <w:r>
-        <w:t xml:space="preserve">All analyses were performed in Python 3.x using pandas, </w:t>
+        <w:t>All analyses were performed in Python 3.</w:t>
+      </w:r>
+      <w:r>
+        <w:rPr>
+          <w:rFonts w:hint="eastAsia"/>
+          <w:lang w:eastAsia="ja-JP"/>
+        </w:rPr>
+        <w:t>14</w:t>
+      </w:r>
+      <w:r>
+        <w:t xml:space="preserve"> using pandas, </w:t>
       </w:r>
       <w:proofErr w:type="spellStart"/>
       <w:r>
@@ -741,11 +820,7 @@
         <w:pStyle w:val="FirstParagraph"/>
       </w:pPr>
       <w:r>
-        <w:t xml:space="preserve">The POFM density map (Figure 3) showed clustering, with higher densities in Tokai and western Japan and lower densities in Hokkaido and parts of Tohoku. The cancer </w:t>
-      </w:r>
-      <w:r>
-        <w:lastRenderedPageBreak/>
-        <w:t>surgery density map (Supplementary Figure S1) showed a different pattern, with the highest surgical volumes in urban prefectures such as Tokyo, Osaka, and Aichi.</w:t>
+        <w:t>The POFM density map (Figure 3) showed clustering, with higher densities in Tokai and western Japan and lower densities in Hokkaido and parts of Tohoku. The cancer surgery density map (Supplementary Figure S1) showed a different pattern, with the highest surgical volumes in urban prefectures such as Tokyo, Osaka, and Aichi.</w:t>
       </w:r>
     </w:p>
     <w:p>
@@ -763,6 +838,7 @@
       <w:bookmarkStart w:id="16" w:name="Xda1057937d0ed8cc33f4b376fb12b3e67d47e70"/>
       <w:bookmarkEnd w:id="15"/>
       <w:r>
+        <w:lastRenderedPageBreak/>
         <w:t>3.3 Association Between Cancer Surgery Density and POFM Density</w:t>
       </w:r>
     </w:p>
@@ -817,15 +893,17 @@
         <w:pStyle w:val="FirstParagraph"/>
       </w:pPr>
       <w:r>
-        <w:t xml:space="preserve">The forest plot (Figure 5) </w:t>
-      </w:r>
-      <w:proofErr w:type="spellStart"/>
-      <w:r>
-        <w:t>summarises</w:t>
-      </w:r>
-      <w:proofErr w:type="spellEnd"/>
-      <w:r>
-        <w:t xml:space="preserve"> the cancer surgery density coefficient across seven sensitivity specifications. None of the seven specifications yielded a statistically significant association (p &lt; 0.05; 0/7 specifications significant). In Specification 7 (adjusted additionally for dentist density), cancer surgery density remained non-significant (p &gt; 0.05), while the inclusion of dentist density did not materially alter other model estimates.</w:t>
+        <w:t>The forest plot (Figure 5) summari</w:t>
+      </w:r>
+      <w:r>
+        <w:rPr>
+          <w:rFonts w:hint="eastAsia"/>
+          <w:lang w:eastAsia="ja-JP"/>
+        </w:rPr>
+        <w:t>z</w:t>
+      </w:r>
+      <w:r>
+        <w:t>es the cancer surgery density coefficient across seven sensitivity specifications. None of the seven specifications yielded a statistically significant association (p &lt; 0.05; 0/7 specifications significant). In Specification 7 (adjusted additionally for dentist density), cancer surgery density remained non-significant (p &gt; 0.05), while the inclusion of dentist density did not materially alter other model estimates.</w:t>
       </w:r>
     </w:p>
     <w:p>
@@ -851,23 +929,7 @@
         <w:pStyle w:val="FirstParagraph"/>
       </w:pPr>
       <w:r>
-        <w:t xml:space="preserve">Global Moran’s I for POFM density was I = 0.210 (p = 0.024), indicating positive spatial autocorrelation. Two prefectures lacked Queen contiguity </w:t>
-      </w:r>
-      <w:proofErr w:type="spellStart"/>
-      <w:r>
-        <w:t>neighbours</w:t>
-      </w:r>
-      <w:proofErr w:type="spellEnd"/>
-      <w:r>
-        <w:t xml:space="preserve"> and were assigned median </w:t>
-      </w:r>
-      <w:proofErr w:type="spellStart"/>
-      <w:r>
-        <w:t>neighbourhood</w:t>
-      </w:r>
-      <w:proofErr w:type="spellEnd"/>
-      <w:r>
-        <w:t xml:space="preserve"> weights.</w:t>
+        <w:t>Global Moran’s I for POFM density was I = 0.210 (p = 0.024), indicating positive spatial autocorrelation. Two prefectures lacked Queen contiguity neighbors and were assigned median neighborhood weights.</w:t>
       </w:r>
     </w:p>
     <w:p>
@@ -899,15 +961,15 @@
         <w:pStyle w:val="a0"/>
       </w:pPr>
       <w:r>
+        <w:t>LISA identified three High-High clusters in western Japan (Hyogo, Okayama, Saga) and three Low-Low clusters (Hokkaido, Iwate, Okinawa; Figure 6). No High-Low or significant Low-High clusters were detected.</w:t>
+      </w:r>
+    </w:p>
+    <w:p>
+      <w:pPr>
+        <w:pStyle w:val="a0"/>
+      </w:pPr>
+      <w:r>
         <w:lastRenderedPageBreak/>
-        <w:t>LISA identified three High-High clusters in western Japan (Hyogo, Okayama, Saga) and three Low-Low clusters (Hokkaido, Iwate, Okinawa; Figure 6). No High-Low or significant Low-High clusters were detected.</w:t>
-      </w:r>
-    </w:p>
-    <w:p>
-      <w:pPr>
-        <w:pStyle w:val="a0"/>
-      </w:pPr>
-      <w:r>
         <w:t>(See Figure 6)</w:t>
       </w:r>
     </w:p>
@@ -961,7 +1023,23 @@
         <w:pStyle w:val="FirstParagraph"/>
       </w:pPr>
       <w:r>
-        <w:t>Coverage is necessary but insufficient for equitable delivery. Japan’s fee schedule creates a national reimbursement pathway for POFM, yet claim density differed more than twofold and was not aligned with regional cancer surgery density. This pattern is consistent with unwarranted variation and supply-sensitive care, where local capacity and practice infrastructure shape use even when insurance coverage is broad (1-4). POFM may therefore serve as a signal of whether regional systems can implement an evidence-based perioperative service.</w:t>
+        <w:t xml:space="preserve">Coverage is necessary but insufficient for equitable delivery. Japan’s fee schedule creates a national reimbursement pathway for POFM, yet claim density differed more than twofold and was not aligned with regional cancer surgery density. This pattern is consistent with unwarranted variation and supply-sensitive care, where local capacity and practice infrastructure shape use even when insurance coverage is broad </w:t>
+      </w:r>
+      <w:r>
+        <w:rPr>
+          <w:rFonts w:hint="eastAsia"/>
+          <w:lang w:eastAsia="ja-JP"/>
+        </w:rPr>
+        <w:t>[</w:t>
+      </w:r>
+      <w:r>
+        <w:t>1-4</w:t>
+      </w:r>
+      <w:r>
+        <w:t>]</w:t>
+      </w:r>
+      <w:r>
+        <w:t>. POFM may therefore serve as a signal of whether regional systems can implement an evidence-based perioperative service.</w:t>
       </w:r>
     </w:p>
     <w:p>
@@ -977,7 +1055,23 @@
         <w:pStyle w:val="a0"/>
       </w:pPr>
       <w:r>
-        <w:t>Even so, the observed pattern is difficult to explain by need alone. Supply-side capacity, including hospital dental departments, trained POFM providers, referral pathways, and multidisciplinary perioperative routines, may strongly influence local uptake (13-15).</w:t>
+        <w:t xml:space="preserve">Even so, the observed pattern is difficult to explain by need alone. Supply-side capacity, including hospital dental departments, trained POFM providers, referral pathways, and multidisciplinary perioperative routines, may strongly influence local uptake </w:t>
+      </w:r>
+      <w:r>
+        <w:rPr>
+          <w:rFonts w:hint="eastAsia"/>
+          <w:lang w:eastAsia="ja-JP"/>
+        </w:rPr>
+        <w:t>[</w:t>
+      </w:r>
+      <w:r>
+        <w:t>13-15</w:t>
+      </w:r>
+      <w:r>
+        <w:t>]</w:t>
+      </w:r>
+      <w:r>
+        <w:t>.</w:t>
       </w:r>
     </w:p>
     <w:p>
@@ -985,15 +1079,17 @@
         <w:pStyle w:val="a0"/>
       </w:pPr>
       <w:r>
-        <w:t xml:space="preserve">Historical implementation momentum may also matter. Early-adopting prefectures or university hospitals may have maintained higher </w:t>
-      </w:r>
-      <w:proofErr w:type="spellStart"/>
-      <w:r>
-        <w:t>utilisation</w:t>
-      </w:r>
-      <w:proofErr w:type="spellEnd"/>
-      <w:r>
-        <w:t xml:space="preserve"> through accumulated expertise and referral routines, consistent with diffusion of healthcare innovations [24,25].</w:t>
+        <w:t>Historical implementation momentum may also matter. Early-adopting prefectures or university hospitals may have maintained higher utili</w:t>
+      </w:r>
+      <w:r>
+        <w:rPr>
+          <w:rFonts w:hint="eastAsia"/>
+          <w:lang w:eastAsia="ja-JP"/>
+        </w:rPr>
+        <w:t>z</w:t>
+      </w:r>
+      <w:r>
+        <w:t>ation through accumulated expertise and referral routines, consistent with diffusion of healthcare innovations [24,25].</w:t>
       </w:r>
     </w:p>
     <w:p>
@@ -1003,16 +1099,19 @@
       <w:bookmarkStart w:id="22" w:name="spatial-regression-and-lisa-clustering"/>
       <w:bookmarkEnd w:id="21"/>
       <w:r>
+        <w:t>4.3 Spatial Diffusion of Supply-Driven Implementation</w:t>
+      </w:r>
+    </w:p>
+    <w:p>
+      <w:pPr>
+        <w:pStyle w:val="FirstParagraph"/>
+      </w:pPr>
+      <w:r>
+        <w:t xml:space="preserve">The significant spatial autoregressive coefficient (ρ = 0.354, p = 0.002) indicates that POFM uptake was spatially patterned. This is compatible with regional diffusion </w:t>
+      </w:r>
+      <w:r>
         <w:lastRenderedPageBreak/>
-        <w:t>4.3 Spatial Diffusion of Supply-Driven Implementation</w:t>
-      </w:r>
-    </w:p>
-    <w:p>
-      <w:pPr>
-        <w:pStyle w:val="FirstParagraph"/>
-      </w:pPr>
-      <w:r>
-        <w:t>The significant spatial autoregressive coefficient (ρ = 0.354, p = 0.002) indicates that POFM uptake was spatially patterned. This is compatible with regional diffusion through professional networks, dental school outreach, and shared hospital dentistry staff pools, although these mechanisms were not directly measured [14,16,25,26].</w:t>
+        <w:t>through professional networks, dental school outreach, and shared hospital dentistry staff pools, although these mechanisms were not directly measured [14,16,25,26].</w:t>
       </w:r>
     </w:p>
     <w:p>
@@ -1020,15 +1119,7 @@
         <w:pStyle w:val="a0"/>
       </w:pPr>
       <w:r>
-        <w:t xml:space="preserve">The SLM fit better than OLS (ΔAIC = -6.0; pseudo-R² = 0.350 vs. OLS R² = 0.197), supporting the importance of spatial dependence in prefecture-level </w:t>
-      </w:r>
-      <w:proofErr w:type="spellStart"/>
-      <w:r>
-        <w:t>utilisation</w:t>
-      </w:r>
-      <w:proofErr w:type="spellEnd"/>
-      <w:r>
-        <w:t xml:space="preserve"> analyses [22]. Cancer surgery density remained non-significant in the SLM, again indicating that this demand proxy alone did not explain POFM provision.</w:t>
+        <w:t>The SLM fit better than OLS (ΔAIC = -6.0; pseudo-R² = 0.350 vs. OLS R² = 0.197), supporting the importance of spatial dependence in prefecture-level utilisation analyses [21]. Cancer surgery density remained non-significant in the SLM, again indicating that this demand proxy alone did not explain POFM provision.</w:t>
       </w:r>
     </w:p>
     <w:p>
@@ -1036,15 +1127,33 @@
         <w:pStyle w:val="a0"/>
       </w:pPr>
       <w:r>
-        <w:t xml:space="preserve">LISA </w:t>
-      </w:r>
-      <w:proofErr w:type="spellStart"/>
-      <w:r>
-        <w:t>localised</w:t>
-      </w:r>
-      <w:proofErr w:type="spellEnd"/>
-      <w:r>
-        <w:t xml:space="preserve"> the spatial signal to HH clusters in Hyogo, Okayama, and Saga, and LL clusters in Hokkaido, Iwate, and Okinawa (Figure 6). These patterns are compatible with established medical-dental collaboration in some western regions and more constrained healthcare access in peripheral areas (16,25,27-29).</w:t>
+        <w:t>LISA locali</w:t>
+      </w:r>
+      <w:r>
+        <w:rPr>
+          <w:rFonts w:hint="eastAsia"/>
+          <w:lang w:eastAsia="ja-JP"/>
+        </w:rPr>
+        <w:t>z</w:t>
+      </w:r>
+      <w:r>
+        <w:t xml:space="preserve">ed the spatial signal to HH clusters in Hyogo, Okayama, and Saga, and LL clusters in Hokkaido, Iwate, and Okinawa (Figure 6). These patterns are compatible with established medical-dental collaboration in some western regions and more constrained healthcare access in peripheral areas </w:t>
+      </w:r>
+      <w:r>
+        <w:rPr>
+          <w:rFonts w:hint="eastAsia"/>
+          <w:lang w:eastAsia="ja-JP"/>
+        </w:rPr>
+        <w:t>[</w:t>
+      </w:r>
+      <w:r>
+        <w:t>16,25,27-29</w:t>
+      </w:r>
+      <w:r>
+        <w:t>]</w:t>
+      </w:r>
+      <w:r>
+        <w:t>.</w:t>
       </w:r>
     </w:p>
     <w:p>
@@ -1070,7 +1179,23 @@
         <w:pStyle w:val="a0"/>
       </w:pPr>
       <w:r>
-        <w:t>First, dental workforce capacity is central. Dentist density showed the strongest bivariate association with POFM density (r = 0.617, p &lt; 0.0001; Figure 2). HH clusters generally had average or above-average dentist density, whereas Okinawa, an LL cluster, had among the lowest dentist densities in Japan [19]. National surveys also show uneven hospital dentist employment, dental referral patterns, perioperative oral care capacity, and dental hygienist roles across facilities (13-16,30-33).</w:t>
+        <w:t xml:space="preserve">First, dental workforce capacity is central. Dentist density showed the strongest bivariate association with POFM density (r = 0.617, p &lt; 0.0001; Figure 2). HH clusters generally had average or above-average dentist density, whereas Okinawa, an LL cluster, had among the lowest dentist densities in Japan [19]. National surveys also show uneven hospital dentist employment, dental referral patterns, perioperative oral care capacity, and dental hygienist roles across facilities </w:t>
+      </w:r>
+      <w:r>
+        <w:rPr>
+          <w:rFonts w:hint="eastAsia"/>
+          <w:lang w:eastAsia="ja-JP"/>
+        </w:rPr>
+        <w:t>[</w:t>
+      </w:r>
+      <w:r>
+        <w:t>13-16,30-33</w:t>
+      </w:r>
+      <w:r>
+        <w:t>]</w:t>
+      </w:r>
+      <w:r>
+        <w:t>.</w:t>
       </w:r>
     </w:p>
     <w:p>
@@ -1090,15 +1215,17 @@
         <w:pStyle w:val="a0"/>
       </w:pPr>
       <w:r>
-        <w:t xml:space="preserve">Second, multidisciplinary infrastructure, including oral medicine specialists, dental representation in cancer care, and </w:t>
-      </w:r>
-      <w:proofErr w:type="spellStart"/>
-      <w:r>
-        <w:t>standardised</w:t>
-      </w:r>
-      <w:proofErr w:type="spellEnd"/>
-      <w:r>
-        <w:t xml:space="preserve"> referral protocols, can facilitate POFM implementation even where surgical caseload is not high [16,28].</w:t>
+        <w:t>Second, multidisciplinary infrastructure, including oral medicine specialists, dental representation in cancer care, and standardi</w:t>
+      </w:r>
+      <w:r>
+        <w:rPr>
+          <w:rFonts w:hint="eastAsia"/>
+          <w:lang w:eastAsia="ja-JP"/>
+        </w:rPr>
+        <w:t>z</w:t>
+      </w:r>
+      <w:r>
+        <w:t>ed referral protocols, can facilitate POFM implementation even where surgical caseload is not high [16,28].</w:t>
       </w:r>
     </w:p>
     <w:p>
@@ -1116,7 +1243,17 @@
       <w:bookmarkStart w:id="24" w:name="comparison-with-prior-studies"/>
       <w:bookmarkEnd w:id="23"/>
       <w:r>
-        <w:t>4.5 Comparison With Prior Studies and Health Policy Implications</w:t>
+        <w:t xml:space="preserve">4.5 Comparison </w:t>
+      </w:r>
+      <w:r>
+        <w:rPr>
+          <w:rFonts w:hint="eastAsia"/>
+          <w:lang w:eastAsia="ja-JP"/>
+        </w:rPr>
+        <w:t>w</w:t>
+      </w:r>
+      <w:r>
+        <w:t>ith Prior Studies and Health Policy Implications</w:t>
       </w:r>
     </w:p>
     <w:p>
@@ -1124,18 +1261,31 @@
         <w:pStyle w:val="FirstParagraph"/>
       </w:pPr>
       <w:r>
-        <w:t xml:space="preserve">Prior Japanese studies have examined POFM mainly at the hospital or patient level and documented postoperative benefits (5,7-10). This study adds a macro-level </w:t>
-      </w:r>
+        <w:t xml:space="preserve">Prior Japanese studies have examined POFM mainly at the hospital or patient level and documented postoperative benefits </w:t>
+      </w:r>
+      <w:r>
+        <w:rPr>
+          <w:rFonts w:hint="eastAsia"/>
+          <w:lang w:eastAsia="ja-JP"/>
+        </w:rPr>
+        <w:t>[</w:t>
+      </w:r>
+      <w:r>
+        <w:t>5,7-10</w:t>
+      </w:r>
+      <w:r>
+        <w:t>]</w:t>
+      </w:r>
+      <w:r>
+        <w:t>. This study adds a macro-level health services perspective: even nationally reimbursed evidence-based care may remain supply-sensitive. POFM may therefore function as a case study of supply-driven implementation within universal health insurance.</w:t>
+      </w:r>
+    </w:p>
+    <w:p>
+      <w:pPr>
+        <w:pStyle w:val="FirstParagraph"/>
+      </w:pPr>
       <w:r>
         <w:lastRenderedPageBreak/>
-        <w:t>health services perspective: even nationally reimbursed evidence-based care may remain supply-sensitive. POFM may therefore function as a case study of supply-driven implementation within universal health insurance.</w:t>
-      </w:r>
-    </w:p>
-    <w:p>
-      <w:pPr>
-        <w:pStyle w:val="FirstParagraph"/>
-      </w:pPr>
-      <w:r>
         <w:t>The implications may extend beyond perioperative oral care. Other multidisciplinary services requiring cross-professional coordination may similarly depend on local implementation capacity rather than clinical need alone.</w:t>
       </w:r>
     </w:p>
@@ -1162,23 +1312,17 @@
         <w:pStyle w:val="a0"/>
       </w:pPr>
       <w:r>
-        <w:t xml:space="preserve">Limitations: First, ecological analyses cannot support individual-level inference [35,36]. Second, POFM claim density captures </w:t>
-      </w:r>
-      <w:proofErr w:type="spellStart"/>
-      <w:r>
-        <w:t>utilisation</w:t>
-      </w:r>
-      <w:proofErr w:type="spellEnd"/>
-      <w:r>
-        <w:t xml:space="preserve"> intensity, not the proportion of eligible patients receiving care. Third, cancer surgery K-codes capture only part of the POFM-eligible population, which may attenuate demand-implementation associations. Fourth, key supply-side variables, including hospital dental department density, cancer-designated hospital capacity, dental school outreach, and referral pathways, were unavailable in open prefecture-level data. Fifth, the cross-sectional design and fixed resolution of 47 prefectures limit causal inference and statistical power; the null finding should be interpreted as no detectable association at this aggregate level, not proof that surgical need is unrelated to delivery. Finally, median </w:t>
-      </w:r>
-      <w:proofErr w:type="spellStart"/>
-      <w:r>
-        <w:t>neighbourhood</w:t>
-      </w:r>
-      <w:proofErr w:type="spellEnd"/>
-      <w:r>
-        <w:t xml:space="preserve"> weights for two island prefectures may marginally influence spatial estimates.</w:t>
+        <w:t>Limitations: First, ecological analyses cannot support individual-level inference [35,36]. Second, POFM claim density captures utili</w:t>
+      </w:r>
+      <w:r>
+        <w:rPr>
+          <w:rFonts w:hint="eastAsia"/>
+          <w:lang w:eastAsia="ja-JP"/>
+        </w:rPr>
+        <w:t>z</w:t>
+      </w:r>
+      <w:r>
+        <w:t>ation intensity, not the proportion of eligible patients receiving care. Third, cancer surgery K-codes capture only part of the POFM-eligible population, which may attenuate demand-implementation associations. Fourth, key supply-side variables, including hospital dental department density, cancer-designated hospital capacity, dental school outreach, and referral pathways, were unavailable in open prefecture-level data. Fifth, the cross-sectional design and fixed resolution of 47 prefectures limit causal inference and statistical power; the null finding should be interpreted as no detectable association at this aggregate level, not proof that surgical need is unrelated to delivery. Finally, median neighborhood weights for two island prefectures may marginally influence spatial estimates.</w:t>
       </w:r>
     </w:p>
     <w:p>
@@ -1204,11 +1348,27 @@
         <w:pStyle w:val="FirstParagraph"/>
       </w:pPr>
       <w:r>
-        <w:t xml:space="preserve">Beyond Japan, these findings carry implications for health systems considering the introduction of perioperative oral care reimbursement. As POFM efficacy in reducing postoperative complications is well established (5–11), reimbursement may </w:t>
+        <w:t xml:space="preserve">Beyond Japan, these findings carry implications for health systems considering the introduction of perioperative oral care reimbursement. As POFM efficacy in reducing postoperative complications is well established </w:t>
+      </w:r>
+      <w:r>
+        <w:rPr>
+          <w:rFonts w:hint="eastAsia"/>
+          <w:lang w:eastAsia="ja-JP"/>
+        </w:rPr>
+        <w:t>[</w:t>
+      </w:r>
+      <w:r>
+        <w:t>5–11</w:t>
+      </w:r>
+      <w:r>
+        <w:t>]</w:t>
+      </w:r>
+      <w:r>
+        <w:t xml:space="preserve">, reimbursement may increasingly be adopted internationally. However, this study suggests that coverage alone may be insufficient: parallel investment in dental workforce development, hospital-dental integration, referral pathway infrastructure, and multidisciplinary care </w:t>
       </w:r>
       <w:r>
         <w:lastRenderedPageBreak/>
-        <w:t>increasingly be adopted internationally. However, this study suggests that coverage alone may be insufficient: parallel investment in dental workforce development, hospital-dental integration, referral pathway infrastructure, and multidisciplinary care routines may be equally necessary to translate formal eligibility into equitable access to evidence-based perioperative care.</w:t>
+        <w:t>routines may be equally necessary to translate formal eligibility into equitable access to evidence-based perioperative care.</w:t>
       </w:r>
     </w:p>
     <w:p>
@@ -1306,7 +1466,6 @@
       <w:bookmarkStart w:id="31" w:name="author-contributions"/>
       <w:bookmarkEnd w:id="30"/>
       <w:r>
-        <w:lastRenderedPageBreak/>
         <w:t>Author Contributions</w:t>
       </w:r>
     </w:p>
@@ -1315,15 +1474,11 @@
         <w:pStyle w:val="FirstParagraph"/>
         <w:rPr>
           <w:rFonts w:asciiTheme="majorHAnsi" w:hAnsiTheme="majorHAnsi" w:cstheme="majorHAnsi"/>
-          <w:sz w:val="22"/>
-          <w:szCs w:val="22"/>
         </w:rPr>
       </w:pPr>
       <w:r>
         <w:rPr>
           <w:rFonts w:asciiTheme="majorHAnsi" w:hAnsiTheme="majorHAnsi" w:cstheme="majorHAnsi"/>
-          <w:sz w:val="22"/>
-          <w:szCs w:val="22"/>
         </w:rPr>
         <w:t>[Author 1]: Conceptualization, Data curation, Formal analysis, Investigation, Methodology, Software, Visualization, Writing – original draft, Writing – review and editing.</w:t>
       </w:r>
@@ -1336,6 +1491,7 @@
         </w:rPr>
       </w:pPr>
       <w:r>
+        <w:lastRenderedPageBreak/>
         <w:t>[Author 2]: Conceptualization, Supervision, Writing – review and editing.</w:t>
       </w:r>
     </w:p>
@@ -1444,7 +1600,31 @@
         <w:pStyle w:val="a9"/>
       </w:pPr>
       <w:r>
-        <w:t>2. Wennberg JE, Fisher ES, Skinner JS. Geography and the debate over Medicare reform. Health Aff (Millwood). 2002;Suppl Web Exclusives:W96-114. doi:10.1377/hlthaff.w2.96.</w:t>
+        <w:t xml:space="preserve">2. Wennberg JE, Fisher ES, Skinner JS. Geography and the debate over Medicare reform. Health Aff (Millwood). </w:t>
+      </w:r>
+      <w:proofErr w:type="gramStart"/>
+      <w:r>
+        <w:t>2002;Suppl</w:t>
+      </w:r>
+      <w:proofErr w:type="gramEnd"/>
+      <w:r>
+        <w:t xml:space="preserve"> Web </w:t>
+      </w:r>
+      <w:proofErr w:type="gramStart"/>
+      <w:r>
+        <w:t>Exclusives:W</w:t>
+      </w:r>
+      <w:proofErr w:type="gramEnd"/>
+      <w:r>
+        <w:t>96-114. doi:10.1377/</w:t>
+      </w:r>
+      <w:proofErr w:type="gramStart"/>
+      <w:r>
+        <w:t>hlthaff.w</w:t>
+      </w:r>
+      <w:proofErr w:type="gramEnd"/>
+      <w:r>
+        <w:t>2.96.</w:t>
       </w:r>
     </w:p>
     <w:p>
@@ -1460,8 +1640,23 @@
         <w:pStyle w:val="a9"/>
       </w:pPr>
       <w:r>
-        <w:lastRenderedPageBreak/>
-        <w:t>4. Wennberg JE. Time to tackle unwarranted variations in practice. BMJ. 2011;342:d1513. doi:10.1136/bmj.d1513.</w:t>
+        <w:t>4. Wennberg JE. Time to tackle unwarranted variations in practice. BMJ. 2011;</w:t>
+      </w:r>
+      <w:proofErr w:type="gramStart"/>
+      <w:r>
+        <w:t>342:d</w:t>
+      </w:r>
+      <w:proofErr w:type="gramEnd"/>
+      <w:r>
+        <w:t>1513. doi:10.1136/</w:t>
+      </w:r>
+      <w:proofErr w:type="gramStart"/>
+      <w:r>
+        <w:t>bmj.d</w:t>
+      </w:r>
+      <w:proofErr w:type="gramEnd"/>
+      <w:r>
+        <w:t>1513.</w:t>
       </w:r>
     </w:p>
     <w:p>
@@ -1471,6 +1666,7 @@
       <w:bookmarkStart w:id="34" w:name="ref-Ishimaru2018"/>
       <w:bookmarkStart w:id="35" w:name="refs"/>
       <w:r>
+        <w:lastRenderedPageBreak/>
         <w:t>5. Ishimaru M, Matsui H, Ono S, Hagiwara Y, Morita K, Yasunaga H. Preoperative oral care and effect on postoperative complications after major cancer surgery. Br J Surg. 2018;105(12):1688-96. Available from: https://pubmed.ncbi.nlm.nih.gov/30088267/</w:t>
       </w:r>
     </w:p>
@@ -1497,7 +1693,15 @@
       </w:r>
       <w:proofErr w:type="spellEnd"/>
       <w:r>
-        <w:t xml:space="preserve"> Oral Cir Bucal. 2023;28(3):e217-28. Available from: https://pubmed.ncbi.nlm.nih.gov/37026607/</w:t>
+        <w:t xml:space="preserve"> Oral Cir Bucal. 2023;28(3</w:t>
+      </w:r>
+      <w:proofErr w:type="gramStart"/>
+      <w:r>
+        <w:t>):e</w:t>
+      </w:r>
+      <w:proofErr w:type="gramEnd"/>
+      <w:r>
+        <w:t>217-28. Available from: https://pubmed.ncbi.nlm.nih.gov/37026607/</w:t>
       </w:r>
     </w:p>
     <w:p>
@@ -1523,7 +1727,15 @@
       </w:r>
       <w:proofErr w:type="spellEnd"/>
       <w:r>
-        <w:t xml:space="preserve"> Y. Effects of preoperative oral management by dentists on postoperative outcomes following esophagectomy: Multilevel propensity score matching and weighting analyses using the Japanese inpatient database. Medicine (Baltimore). 2019;98(17):e15376. Available from: https://pubmed.ncbi.nlm.nih.gov/31027127/</w:t>
+        <w:t xml:space="preserve"> Y. Effects of preoperative oral management by dentists on postoperative outcomes following esophagectomy: Multilevel propensity score matching and weighting analyses using the Japanese inpatient database. Medicine (Baltimore). 2019;98(17</w:t>
+      </w:r>
+      <w:proofErr w:type="gramStart"/>
+      <w:r>
+        <w:t>):e</w:t>
+      </w:r>
+      <w:proofErr w:type="gramEnd"/>
+      <w:r>
+        <w:t>15376. Available from: https://pubmed.ncbi.nlm.nih.gov/31027127/</w:t>
       </w:r>
     </w:p>
     <w:p>
@@ -1557,7 +1769,23 @@
       </w:r>
       <w:proofErr w:type="spellEnd"/>
       <w:r>
-        <w:t xml:space="preserve"> M, Hasegawa T, Komori T, Yamada SI, et al. Effect of perioperative oral care on prevention of postoperative pneumonia associated with esophageal cancer surgery: A multicenter case-control study with propensity score matching analysis. Medicine (Baltimore). 2017;96(33):e7436. Available from: https://pubmed.ncbi.nlm.nih.gov/28816937/</w:t>
+        <w:t xml:space="preserve"> M, Hasegawa T, Komori T, Yamada SI, et al. Effect of perioperative oral care on prevention of postoperative pneumonia associated with esophageal cancer surgery: A multicenter case-control study with propensity </w:t>
+      </w:r>
+      <w:proofErr w:type="gramStart"/>
+      <w:r>
+        <w:t>score</w:t>
+      </w:r>
+      <w:proofErr w:type="gramEnd"/>
+      <w:r>
+        <w:t xml:space="preserve"> matching analysis. Medicine (Baltimore). 2017;96(33</w:t>
+      </w:r>
+      <w:proofErr w:type="gramStart"/>
+      <w:r>
+        <w:t>):e</w:t>
+      </w:r>
+      <w:proofErr w:type="gramEnd"/>
+      <w:r>
+        <w:t>7436. Available from: https://pubmed.ncbi.nlm.nih.gov/28816937/</w:t>
       </w:r>
     </w:p>
     <w:p>
@@ -1567,7 +1795,15 @@
       <w:bookmarkStart w:id="39" w:name="ref-Iwata2019"/>
       <w:bookmarkEnd w:id="38"/>
       <w:r>
-        <w:t>9. Iwata E, Hasegawa T, Yamada SI, Kawashita Y, Yoshimatsu M, Mizutani T, et al. Effects of perioperative oral care on prevention of postoperative pneumonia after lung resection: Multicenter retrospective study with propensity score matching analysis. Surgery. 2019;165(5):1003-7. Available from: https://pubmed.ncbi.nlm.nih.gov/30765141/</w:t>
+        <w:t xml:space="preserve">9. Iwata E, Hasegawa T, Yamada SI, Kawashita Y, Yoshimatsu M, Mizutani T, et al. Effects of perioperative oral care on prevention of postoperative pneumonia after lung resection: Multicenter retrospective study with propensity </w:t>
+      </w:r>
+      <w:proofErr w:type="gramStart"/>
+      <w:r>
+        <w:t>score</w:t>
+      </w:r>
+      <w:proofErr w:type="gramEnd"/>
+      <w:r>
+        <w:t xml:space="preserve"> matching analysis. Surgery. 2019;165(5):1003-7. Available from: https://pubmed.ncbi.nlm.nih.gov/30765141/</w:t>
       </w:r>
     </w:p>
     <w:p>
@@ -1617,7 +1853,15 @@
       </w:r>
       <w:proofErr w:type="spellEnd"/>
       <w:r>
-        <w:t xml:space="preserve"> S, et al. Effect of perioperative oral management on the prevention of surgical site infection after colorectal cancer surgery: A multicenter retrospective analysis of 698 patients via analysis of covariance using propensity score. Medicine (Baltimore). 2018;97(40):e12545. Available from: https://pubmed.ncbi.nlm.nih.gov/30290611/</w:t>
+        <w:t xml:space="preserve"> S, et al. Effect of perioperative oral management on the prevention of surgical site infection after colorectal cancer surgery: A multicenter retrospective analysis of 698 patients via analysis of covariance using propensity score. Medicine (Baltimore). 2018;97(40</w:t>
+      </w:r>
+      <w:proofErr w:type="gramStart"/>
+      <w:r>
+        <w:t>):e</w:t>
+      </w:r>
+      <w:proofErr w:type="gramEnd"/>
+      <w:r>
+        <w:t>12545. Available from: https://pubmed.ncbi.nlm.nih.gov/30290611/</w:t>
       </w:r>
     </w:p>
     <w:p>
@@ -1655,8 +1899,11 @@
       <w:bookmarkStart w:id="43" w:name="ref-Kodama2021"/>
       <w:bookmarkEnd w:id="42"/>
       <w:r>
+        <w:t xml:space="preserve">13. Kodama T, Ida Y, Oshima K, Miura H. Are public oral care services evenly distributed? Nation-wide assessment of the provision of oral care in Japan using the </w:t>
+      </w:r>
+      <w:r>
         <w:lastRenderedPageBreak/>
-        <w:t>13. Kodama T, Ida Y, Oshima K, Miura H. Are public oral care services evenly distributed? Nation-wide assessment of the provision of oral care in Japan using the national database of health insurance claims. Int J Environ Res Public Health. 2021;18(20):10850.</w:t>
+        <w:t>national database of health insurance claims. Int J Environ Res Public Health. 2021;18(20):10850.</w:t>
       </w:r>
     </w:p>
     <w:p>
@@ -1684,7 +1931,15 @@
       <w:bookmarkStart w:id="45" w:name="ref-Nomura2021"/>
       <w:bookmarkEnd w:id="44"/>
       <w:r>
-        <w:t>15. Nomura Y, Ohara Y, Yamamoto Y, Okada A, Hosoya N, Hanada N, et al. Dental hygienists’ practice in perioperative oral care management according to the Japanese dental hygienists survey 2019. Int J Environ Res Public Health. 2021;18(1):114. Available from: https://pubmed.ncbi.nlm.nih.gov/33375276/</w:t>
+        <w:t xml:space="preserve">15. Nomura Y, Ohara Y, Yamamoto Y, Okada A, Hosoya N, Hanada N, et al. Dental hygienists’ practice in perioperative oral care management according to the Japanese dental </w:t>
+      </w:r>
+      <w:proofErr w:type="gramStart"/>
+      <w:r>
+        <w:t>hygienists</w:t>
+      </w:r>
+      <w:proofErr w:type="gramEnd"/>
+      <w:r>
+        <w:t xml:space="preserve"> survey 2019. Int J Environ Res Public Health. 2021;18(1):114. Available from: https://pubmed.ncbi.nlm.nih.gov/33375276/</w:t>
       </w:r>
     </w:p>
     <w:p>
@@ -1702,7 +1957,23 @@
       </w:r>
       <w:proofErr w:type="spellEnd"/>
       <w:r>
-        <w:t xml:space="preserve"> M, Sakata N, Watanabe T, et al. Regional inequality in dental care utilization in Japan: An ecological study using the national database of health insurance claims. Lancet Reg Health West Pac. 2021;12:100170.</w:t>
+        <w:t xml:space="preserve"> M, Sakata N, Watanabe T, et al. </w:t>
+      </w:r>
+      <w:proofErr w:type="gramStart"/>
+      <w:r>
+        <w:t>Regional</w:t>
+      </w:r>
+      <w:proofErr w:type="gramEnd"/>
+      <w:r>
+        <w:t xml:space="preserve"> inequality in dental care utilization in Japan: An ecological study using the national database of health insurance claims. Lancet Reg Health West Pac. </w:t>
+      </w:r>
+      <w:proofErr w:type="gramStart"/>
+      <w:r>
+        <w:t>2021;12:100170</w:t>
+      </w:r>
+      <w:proofErr w:type="gramEnd"/>
+      <w:r>
+        <w:t>.</w:t>
       </w:r>
     </w:p>
     <w:p>
@@ -1758,23 +2029,7 @@
       <w:bookmarkStart w:id="50" w:name="ref-Anselin1995"/>
       <w:bookmarkEnd w:id="49"/>
       <w:r>
-        <w:t xml:space="preserve">20. </w:t>
-      </w:r>
-      <w:proofErr w:type="spellStart"/>
-      <w:r>
-        <w:t>Anselin</w:t>
-      </w:r>
-      <w:proofErr w:type="spellEnd"/>
-      <w:r>
-        <w:t xml:space="preserve"> L. Local indicators of spatial association-LISA. </w:t>
-      </w:r>
-      <w:proofErr w:type="spellStart"/>
-      <w:r>
-        <w:t>Geogr</w:t>
-      </w:r>
-      <w:proofErr w:type="spellEnd"/>
-      <w:r>
-        <w:t xml:space="preserve"> Anal. 1995;27(2):93-115.</w:t>
+        <w:t>20. Anselin L. Spatial econometrics: Methods and models. Dordrecht: Kluwer Academic Publishers; 1988.</w:t>
       </w:r>
     </w:p>
     <w:p>
@@ -1784,15 +2039,7 @@
       <w:bookmarkStart w:id="51" w:name="ref-Anselin1988"/>
       <w:bookmarkEnd w:id="50"/>
       <w:r>
-        <w:t xml:space="preserve">21. </w:t>
-      </w:r>
-      <w:proofErr w:type="spellStart"/>
-      <w:r>
-        <w:t>Anselin</w:t>
-      </w:r>
-      <w:proofErr w:type="spellEnd"/>
-      <w:r>
-        <w:t xml:space="preserve"> L. Spatial econometrics: Methods and models. Dordrecht: Kluwer Academic Publishers; 1988.</w:t>
+        <w:t>21. LeSage JP, Pace RK. Introduction to spatial econometrics. Boca Raton: Chapman and Hall/CRC; 2009.</w:t>
       </w:r>
     </w:p>
     <w:p>
@@ -1802,7 +2049,7 @@
       <w:bookmarkStart w:id="52" w:name="ref-LeSage2009"/>
       <w:bookmarkEnd w:id="51"/>
       <w:r>
-        <w:t>22. LeSage JP, Pace RK. Introduction to spatial econometrics. Boca Raton: Chapman and Hall/CRC; 2009.</w:t>
+        <w:t>22. Anselin L. Local indicators of spatial association-LISA. Geogr Anal. 1995;27(2):93-115.</w:t>
       </w:r>
     </w:p>
     <w:p>
@@ -1822,7 +2069,6 @@
       <w:bookmarkStart w:id="54" w:name="ref-Greenhalgh2004"/>
       <w:bookmarkEnd w:id="53"/>
       <w:r>
-        <w:lastRenderedPageBreak/>
         <w:t>24. Greenhalgh T, Robert G, Macfarlane F, Bate P, Kyriakidou O. Diffusion of innovations in service organizations: Systematic review and recommendations. Milbank Q. 2004;82(4):581-629.</w:t>
       </w:r>
     </w:p>
@@ -1833,6 +2079,7 @@
       <w:bookmarkStart w:id="55" w:name="ref-Ibuka2020"/>
       <w:bookmarkEnd w:id="54"/>
       <w:r>
+        <w:lastRenderedPageBreak/>
         <w:t xml:space="preserve">25. Ibuka Y, Matsuda Y, Shoji K, Ishigaki T. Evaluation of regional variations in healthcare utilization. </w:t>
       </w:r>
       <w:proofErr w:type="spellStart"/>
@@ -1903,7 +2150,15 @@
       </w:r>
       <w:proofErr w:type="spellEnd"/>
       <w:r>
-        <w:t xml:space="preserve"> S, Matsumoto T, Yoshimatsu Y, Matsumoto S, et al. Current state and challenges of dental intervention in aspiration pneumonia management from the perspective of hospitalists: A cross-sectional survey in Japan. Int J Gen Med. 2025;18:6889-98.</w:t>
+        <w:t xml:space="preserve"> S, Matsumoto T, Yoshimatsu Y, Matsumoto S, et al. Current state and challenges of dental intervention in aspiration pneumonia management from the perspective of hospitalists: A cross-sectional survey in Japan. Int J Gen Med. </w:t>
+      </w:r>
+      <w:proofErr w:type="gramStart"/>
+      <w:r>
+        <w:t>2025;18:6889</w:t>
+      </w:r>
+      <w:proofErr w:type="gramEnd"/>
+      <w:r>
+        <w:t>-98.</w:t>
       </w:r>
     </w:p>
     <w:p>
@@ -1929,7 +2184,15 @@
       </w:r>
       <w:proofErr w:type="spellEnd"/>
       <w:r>
-        <w:t xml:space="preserve"> Y, Saito R. Geographic variation in inpatient medical expenditure among older adults aged 75 years and above in Japan: A three-level multilevel analysis of nationwide data. Front Public Health. 2024;12:1306013.</w:t>
+        <w:t xml:space="preserve"> Y, Saito R. Geographic variation in inpatient medical expenditure among older adults aged 75 years and above in Japan: A three-level multilevel analysis of nationwide data. Front Public Health. </w:t>
+      </w:r>
+      <w:proofErr w:type="gramStart"/>
+      <w:r>
+        <w:t>2024;12:1306013</w:t>
+      </w:r>
+      <w:proofErr w:type="gramEnd"/>
+      <w:r>
+        <w:t>.</w:t>
       </w:r>
     </w:p>
     <w:p>
@@ -2027,7 +2290,15 @@
       </w:r>
       <w:proofErr w:type="spellEnd"/>
       <w:r>
-        <w:t xml:space="preserve"> One. 2023;18(10):e0292547.</w:t>
+        <w:t xml:space="preserve"> One. 2023;18(10</w:t>
+      </w:r>
+      <w:proofErr w:type="gramStart"/>
+      <w:r>
+        <w:t>):e</w:t>
+      </w:r>
+      <w:proofErr w:type="gramEnd"/>
+      <w:r>
+        <w:t>0292547.</w:t>
       </w:r>
     </w:p>
     <w:p>
@@ -2037,8 +2308,15 @@
       <w:bookmarkStart w:id="65" w:name="ref-Morgenstern1998"/>
       <w:bookmarkEnd w:id="64"/>
       <w:r>
-        <w:lastRenderedPageBreak/>
-        <w:t>35. Morgenstern H. Ecologic studies in epidemiology: Concepts, principles, and methods. Annu Rev Public Health. 1995;16:61-81. Available from: https://pubmed.ncbi.nlm.nih.gov/7639884/</w:t>
+        <w:t xml:space="preserve">35. Morgenstern H. Ecologic studies in epidemiology: Concepts, principles, and methods. Annu Rev Public Health. </w:t>
+      </w:r>
+      <w:proofErr w:type="gramStart"/>
+      <w:r>
+        <w:t>1995;16:61</w:t>
+      </w:r>
+      <w:proofErr w:type="gramEnd"/>
+      <w:r>
+        <w:t>-81. Available from: https://pubmed.ncbi.nlm.nih.gov/7639884/</w:t>
       </w:r>
     </w:p>
     <w:p>
@@ -2048,6 +2326,7 @@
       <w:bookmarkStart w:id="66" w:name="ref-Greenland2001"/>
       <w:bookmarkEnd w:id="65"/>
       <w:r>
+        <w:lastRenderedPageBreak/>
         <w:t>36. Greenland S. Ecologic versus individual-level sources of bias in ecologic estimates of contextual health effects. Int J Epidemiol. 2001;30(6):1343-50. Available from: https://pubmed.ncbi.nlm.nih.gov/11821344/</w:t>
       </w:r>
     </w:p>
@@ -2919,7 +3198,6 @@
         <w:pStyle w:val="FirstParagraph"/>
       </w:pPr>
       <w:r>
-        <w:lastRenderedPageBreak/>
         <w:t>Figure 3: Prefectural distribution of perioperative oral management (POFM) density (B001-2 + B001-3 claim counts per 100,000 population, FY2023).</w:t>
       </w:r>
     </w:p>
@@ -2931,6 +3209,7 @@
         <w:rPr>
           <w:noProof/>
         </w:rPr>
+        <w:lastRenderedPageBreak/>
         <w:drawing>
           <wp:inline distT="0" distB="0" distL="0" distR="0" wp14:anchorId="449E1F68" wp14:editId="0127A177">
             <wp:extent cx="4267200" cy="3606997"/>

</xml_diff>